<commit_message>
Add order form document tab
</commit_message>
<xml_diff>
--- a/templates/Rahmenvertrag [aktuelle Version].docx
+++ b/templates/Rahmenvertrag [aktuelle Version].docx
@@ -2470,7 +2470,21 @@
           <w:color w:val="auto"/>
           <w:sz w:val="20"/>
         </w:rPr>
-        <w:t xml:space="preserve">Monate </w:t>
+        <w:t>Monate</w:t>
+      </w:r>
+      <w:r>
+        <w:rPr>
+          <w:color w:val="auto"/>
+          <w:sz w:val="20"/>
+        </w:rPr>
+        <w:t>n</w:t>
+      </w:r>
+      <w:r>
+        <w:rPr>
+          <w:color w:val="auto"/>
+          <w:sz w:val="20"/>
+        </w:rPr>
+        <w:t xml:space="preserve"> </w:t>
       </w:r>
       <w:r>
         <w:rPr>
@@ -14163,7 +14177,7 @@
             </wp:anchor>
           </w:drawing>
         </mc:Choice>
-        <mc:Fallback xmlns:arto="http://schemas.microsoft.com/office/word/2006/arto" xmlns:a14="http://schemas.microsoft.com/office/drawing/2010/main" xmlns:pic="http://schemas.openxmlformats.org/drawingml/2006/picture" xmlns:a="http://schemas.openxmlformats.org/drawingml/2006/main">
+        <mc:Fallback xmlns:a="http://schemas.openxmlformats.org/drawingml/2006/main" xmlns:pic="http://schemas.openxmlformats.org/drawingml/2006/picture" xmlns:a14="http://schemas.microsoft.com/office/drawing/2010/main" xmlns:arto="http://schemas.microsoft.com/office/word/2006/arto">
           <w:pict w14:anchorId="2DE2E871">
             <v:rect id="Rectangle 2" style="position:absolute;margin-left:-95.4pt;margin-top:-34.65pt;width:645.15pt;height:15.85pt;z-index:251658240;visibility:visible;mso-wrap-style:square;mso-width-percent:0;mso-height-percent:0;mso-wrap-distance-left:9pt;mso-wrap-distance-top:0;mso-wrap-distance-right:9pt;mso-wrap-distance-bottom:0;mso-position-horizontal:absolute;mso-position-horizontal-relative:text;mso-position-vertical:absolute;mso-position-vertical-relative:text;mso-width-percent:0;mso-height-percent:0;mso-width-relative:margin;mso-height-relative:margin;v-text-anchor:middle" o:spid="_x0000_s1026" fillcolor="#ffff69 [3212]" stroked="f" strokeweight="2pt" w14:anchorId="4D33DB71" o:gfxdata="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"/>
           </w:pict>
@@ -22562,10 +22576,6 @@
 </file>
 
 <file path=customXml/item1.xml><?xml version="1.0" encoding="utf-8"?>
-<b:Sources xmlns:b="http://schemas.openxmlformats.org/officeDocument/2006/bibliography" xmlns="http://schemas.openxmlformats.org/officeDocument/2006/bibliography" SelectedStyle="/APASixthEditionOfficeOnline.xsl" StyleName="APA" Version="6"/>
-</file>
-
-<file path=customXml/item2.xml><?xml version="1.0" encoding="utf-8"?>
 <?mso-contentType ?>
 <FormTemplates xmlns="http://schemas.microsoft.com/sharepoint/v3/contenttype/forms">
   <Display>DocumentLibraryForm</Display>
@@ -22574,7 +22584,34 @@
 </FormTemplates>
 </file>
 
+<file path=customXml/item2.xml><?xml version="1.0" encoding="utf-8"?>
+<b:Sources xmlns:b="http://schemas.openxmlformats.org/officeDocument/2006/bibliography" xmlns="http://schemas.openxmlformats.org/officeDocument/2006/bibliography" SelectedStyle="/APASixthEditionOfficeOnline.xsl" StyleName="APA" Version="6"/>
+</file>
+
 <file path=customXml/item3.xml><?xml version="1.0" encoding="utf-8"?>
+<p:properties xmlns:p="http://schemas.microsoft.com/office/2006/metadata/properties" xmlns:xsi="http://www.w3.org/2001/XMLSchema-instance" xmlns:pc="http://schemas.microsoft.com/office/infopath/2007/PartnerControls">
+  <documentManagement>
+    <lcf76f155ced4ddcb4097134ff3c332f xmlns="f1d731da-047f-4152-9ead-bbe9b5d353c6">
+      <Terms xmlns="http://schemas.microsoft.com/office/infopath/2007/PartnerControls"/>
+    </lcf76f155ced4ddcb4097134ff3c332f>
+    <TaxCatchAll xmlns="0c816845-af15-417b-8dad-5ff9495301df" xsi:nil="true"/>
+    <Signed xmlns="f1d731da-047f-4152-9ead-bbe9b5d353c6">false</Signed>
+    <ClosedWon xmlns="f1d731da-047f-4152-9ead-bbe9b5d353c6">true</ClosedWon>
+  </documentManagement>
+</p:properties>
+</file>
+
+<file path=customXml/item4.xml><?xml version="1.0" encoding="utf-8"?>
+<properties xmlns="http://www.imanage.com/work/xmlschema">
+  <documentid>TWG_AKTIV!44820798.3</documentid>
+  <senderid>G.SCHMID</senderid>
+  <senderemail>G.SCHMID@TAYLORWESSING.COM</senderemail>
+  <lastmodified>2026-05-22T15:43:00.0000000+02:00</lastmodified>
+  <database>TWG_AKTIV</database>
+</properties>
+</file>
+
+<file path=customXml/item5.xml><?xml version="1.0" encoding="utf-8"?>
 <ct:contentTypeSchema xmlns:ct="http://schemas.microsoft.com/office/2006/metadata/contentType" xmlns:ma="http://schemas.microsoft.com/office/2006/metadata/properties/metaAttributes" ct:_="" ma:_="" ma:contentTypeName="Dokument" ma:contentTypeID="0x010100635E1E2B52E4A544AA27C2F43F73FF65" ma:contentTypeVersion="20" ma:contentTypeDescription="Ein neues Dokument erstellen." ma:contentTypeScope="" ma:versionID="7c44017cd8091298e41e40722edbf62f">
   <xsd:schema xmlns:xsd="http://www.w3.org/2001/XMLSchema" xmlns:xs="http://www.w3.org/2001/XMLSchema" xmlns:p="http://schemas.microsoft.com/office/2006/metadata/properties" xmlns:ns2="0c816845-af15-417b-8dad-5ff9495301df" xmlns:ns3="f1d731da-047f-4152-9ead-bbe9b5d353c6" targetNamespace="http://schemas.microsoft.com/office/2006/metadata/properties" ma:root="true" ma:fieldsID="08e894dd3ad3a855ee3b8a8f056e5fa9" ns2:_="" ns3:_="">
     <xsd:import namespace="0c816845-af15-417b-8dad-5ff9495301df"/>
@@ -22841,30 +22878,15 @@
 </ct:contentTypeSchema>
 </file>
 
-<file path=customXml/item4.xml><?xml version="1.0" encoding="utf-8"?>
-<properties xmlns="http://www.imanage.com/work/xmlschema">
-  <documentid>TWG_AKTIV!44820798.3</documentid>
-  <senderid>G.SCHMID</senderid>
-  <senderemail>G.SCHMID@TAYLORWESSING.COM</senderemail>
-  <lastmodified>2026-05-22T15:43:00.0000000+02:00</lastmodified>
-  <database>TWG_AKTIV</database>
-</properties>
+<file path=customXml/itemProps1.xml><?xml version="1.0" encoding="utf-8"?>
+<ds:datastoreItem xmlns:ds="http://schemas.openxmlformats.org/officeDocument/2006/customXml" ds:itemID="{34E88B45-2478-46E8-B22F-4EDE89E0722A}">
+  <ds:schemaRefs>
+    <ds:schemaRef ds:uri="http://schemas.microsoft.com/sharepoint/v3/contenttype/forms"/>
+  </ds:schemaRefs>
+</ds:datastoreItem>
 </file>
 
-<file path=customXml/item5.xml><?xml version="1.0" encoding="utf-8"?>
-<p:properties xmlns:p="http://schemas.microsoft.com/office/2006/metadata/properties" xmlns:xsi="http://www.w3.org/2001/XMLSchema-instance" xmlns:pc="http://schemas.microsoft.com/office/infopath/2007/PartnerControls">
-  <documentManagement>
-    <lcf76f155ced4ddcb4097134ff3c332f xmlns="f1d731da-047f-4152-9ead-bbe9b5d353c6">
-      <Terms xmlns="http://schemas.microsoft.com/office/infopath/2007/PartnerControls"/>
-    </lcf76f155ced4ddcb4097134ff3c332f>
-    <TaxCatchAll xmlns="0c816845-af15-417b-8dad-5ff9495301df" xsi:nil="true"/>
-    <Signed xmlns="f1d731da-047f-4152-9ead-bbe9b5d353c6">false</Signed>
-    <ClosedWon xmlns="f1d731da-047f-4152-9ead-bbe9b5d353c6">true</ClosedWon>
-  </documentManagement>
-</p:properties>
-</file>
-
-<file path=customXml/itemProps1.xml><?xml version="1.0" encoding="utf-8"?>
+<file path=customXml/itemProps2.xml><?xml version="1.0" encoding="utf-8"?>
 <ds:datastoreItem xmlns:ds="http://schemas.openxmlformats.org/officeDocument/2006/customXml" ds:itemID="{A619981A-5DD6-DB49-ACBF-8BE5134A436C}">
   <ds:schemaRefs>
     <ds:schemaRef ds:uri="http://schemas.openxmlformats.org/officeDocument/2006/bibliography"/>
@@ -22872,15 +22894,26 @@
 </ds:datastoreItem>
 </file>
 
-<file path=customXml/itemProps2.xml><?xml version="1.0" encoding="utf-8"?>
-<ds:datastoreItem xmlns:ds="http://schemas.openxmlformats.org/officeDocument/2006/customXml" ds:itemID="{34E88B45-2478-46E8-B22F-4EDE89E0722A}">
+<file path=customXml/itemProps3.xml><?xml version="1.0" encoding="utf-8"?>
+<ds:datastoreItem xmlns:ds="http://schemas.openxmlformats.org/officeDocument/2006/customXml" ds:itemID="{E120CFE9-9270-4BE3-A28E-5DC18F932F96}">
   <ds:schemaRefs>
-    <ds:schemaRef ds:uri="http://schemas.microsoft.com/sharepoint/v3/contenttype/forms"/>
+    <ds:schemaRef ds:uri="http://schemas.microsoft.com/office/2006/metadata/properties"/>
+    <ds:schemaRef ds:uri="http://schemas.microsoft.com/office/infopath/2007/PartnerControls"/>
+    <ds:schemaRef ds:uri="f1d731da-047f-4152-9ead-bbe9b5d353c6"/>
+    <ds:schemaRef ds:uri="0c816845-af15-417b-8dad-5ff9495301df"/>
   </ds:schemaRefs>
 </ds:datastoreItem>
 </file>
 
-<file path=customXml/itemProps3.xml><?xml version="1.0" encoding="utf-8"?>
+<file path=customXml/itemProps4.xml><?xml version="1.0" encoding="utf-8"?>
+<ds:datastoreItem xmlns:ds="http://schemas.openxmlformats.org/officeDocument/2006/customXml" ds:itemID="{09E1A8A1-22E2-4B42-A30A-E15F2512938A}">
+  <ds:schemaRefs>
+    <ds:schemaRef ds:uri="http://www.imanage.com/work/xmlschema"/>
+  </ds:schemaRefs>
+</ds:datastoreItem>
+</file>
+
+<file path=customXml/itemProps5.xml><?xml version="1.0" encoding="utf-8"?>
 <ds:datastoreItem xmlns:ds="http://schemas.openxmlformats.org/officeDocument/2006/customXml" ds:itemID="{834BBC87-BB9C-44E6-8ECA-8F131C6E52EA}">
   <ds:schemaRefs>
     <ds:schemaRef ds:uri="http://schemas.microsoft.com/office/2006/metadata/contentType"/>
@@ -22897,23 +22930,4 @@
     <ds:schemaRef ds:uri="http://schemas.microsoft.com/internal/obd"/>
   </ds:schemaRefs>
 </ds:datastoreItem>
-</file>
-
-<file path=customXml/itemProps4.xml><?xml version="1.0" encoding="utf-8"?>
-<ds:datastoreItem xmlns:ds="http://schemas.openxmlformats.org/officeDocument/2006/customXml" ds:itemID="{09E1A8A1-22E2-4B42-A30A-E15F2512938A}">
-  <ds:schemaRefs>
-    <ds:schemaRef ds:uri="http://www.imanage.com/work/xmlschema"/>
-  </ds:schemaRefs>
-</ds:datastoreItem>
-</file>
-
-<file path=customXml/itemProps5.xml><?xml version="1.0" encoding="utf-8"?>
-<ds:datastoreItem xmlns:ds="http://schemas.openxmlformats.org/officeDocument/2006/customXml" ds:itemID="{E120CFE9-9270-4BE3-A28E-5DC18F932F96}">
-  <ds:schemaRefs>
-    <ds:schemaRef ds:uri="http://schemas.microsoft.com/office/2006/metadata/properties"/>
-    <ds:schemaRef ds:uri="http://schemas.microsoft.com/office/infopath/2007/PartnerControls"/>
-    <ds:schemaRef ds:uri="f1d731da-047f-4152-9ead-bbe9b5d353c6"/>
-    <ds:schemaRef ds:uri="0c816845-af15-417b-8dad-5ff9495301df"/>
-  </ds:schemaRefs>
-</ds:datastoreItem>
 </file>
</xml_diff>